<commit_message>
Notice : correction du bouton Retour de ModifActionsAssig
Co-Authored-By: Claude Opus 5.5 <noreply@anthropic.com>
Claude-Session: https://claude.ai/code/session_01GKfrYG79ACwYQtm1cXoLGF
</commit_message>
<xml_diff>
--- a/docs/Notice_maintenance_Suivi_des_actions_DPI.docx
+++ b/docs/Notice_maintenance_Suivi_des_actions_DPI.docx
@@ -8758,125 +8758,26 @@
         <w:t xml:space="preserve">, souvent après un copier-coller (champ date, liste Thème, cases à cocher, galerie). Après toute duplication, relire les noms de contrôles des formules.</w:t>
       </w:r>
     </w:p>
-    <w:tbl>
-      <w:tblPr>
-        <w:tblW w:type="dxa" w:w="9638"/>
-        <w:tblBorders>
-          <w:top w:val="none" w:color="FFFFFF" w:sz="0"/>
-          <w:left w:val="single" w:color="B26A00" w:sz="12"/>
-          <w:bottom w:val="none" w:color="FFFFFF" w:sz="0"/>
-          <w:right w:val="none" w:color="FFFFFF" w:sz="0"/>
-          <w:insideH w:val="none" w:color="FFFFFF" w:sz="0"/>
-          <w:insideV w:val="none" w:color="FFFFFF" w:sz="0"/>
-        </w:tblBorders>
-      </w:tblPr>
-      <w:tblGrid>
-        <w:gridCol w:w="9638"/>
-      </w:tblGrid>
-      <w:tr>
-        <w:tc>
-          <w:tcPr>
-            <w:tcW w:type="dxa" w:w="9638"/>
-            <w:shd w:fill="FFF4E5" w:color="auto" w:val="clear"/>
-            <w:tcMar>
-              <w:top w:type="dxa" w:w="100"/>
-              <w:left w:type="dxa" w:w="200"/>
-              <w:bottom w:type="dxa" w:w="100"/>
-              <w:right w:type="dxa" w:w="160"/>
-            </w:tcMar>
-          </w:tcPr>
-          <w:p>
-            <w:pPr>
-              <w:spacing w:after="60"/>
-            </w:pPr>
-            <w:r>
-              <w:rPr>
-                <w:b/>
-                <w:bCs/>
-                <w:color w:val="B26A00"/>
-              </w:rPr>
-              <w:t xml:space="preserve">Anomalie connue, non corrigée</w:t>
-            </w:r>
-          </w:p>
-          <w:p>
-            <w:pPr>
-              <w:spacing w:after="40"/>
-            </w:pPr>
-            <w:r>
-              <w:t xml:space="preserve">Le bouton Retour de </w:t>
-            </w:r>
-            <w:r>
-              <w:rPr>
-                <w:rFonts w:ascii="Consolas" w:cs="Consolas" w:eastAsia="Consolas" w:hAnsi="Consolas"/>
-                <w:color w:val="00695C"/>
-                <w:sz w:val="19"/>
-                <w:szCs w:val="19"/>
-              </w:rPr>
-              <w:t xml:space="preserve">ModifActionsAssig</w:t>
-            </w:r>
-            <w:r>
-              <w:t xml:space="preserve"> (</w:t>
-            </w:r>
-            <w:r>
-              <w:rPr>
-                <w:rFonts w:ascii="Consolas" w:cs="Consolas" w:eastAsia="Consolas" w:hAnsi="Consolas"/>
-                <w:color w:val="00695C"/>
-                <w:sz w:val="19"/>
-                <w:szCs w:val="19"/>
-              </w:rPr>
-              <w:t xml:space="preserve">btnRetour_MAA</w:t>
-            </w:r>
-            <w:r>
-              <w:t xml:space="preserve">) annule et remet en lecture le formulaire </w:t>
-            </w:r>
-            <w:r>
-              <w:rPr>
-                <w:b/>
-                <w:bCs/>
-              </w:rPr>
-              <w:t xml:space="preserve">`frmActionCreee`</w:t>
-            </w:r>
-            <w:r>
-              <w:t xml:space="preserve"> (écran Créées) au lieu de </w:t>
-            </w:r>
-            <w:r>
-              <w:rPr>
-                <w:b/>
-                <w:bCs/>
-              </w:rPr>
-              <w:t xml:space="preserve">`frmActionAssignee`</w:t>
-            </w:r>
-            <w:r>
-              <w:t xml:space="preserve">. Conséquence possible : des saisies non enregistrées restent affichées en revenant sur une action assignée. Correction : remplacer </w:t>
-            </w:r>
-            <w:r>
-              <w:rPr>
-                <w:rFonts w:ascii="Consolas" w:cs="Consolas" w:eastAsia="Consolas" w:hAnsi="Consolas"/>
-                <w:color w:val="00695C"/>
-                <w:sz w:val="19"/>
-                <w:szCs w:val="19"/>
-              </w:rPr>
-              <w:t xml:space="preserve">frmActionCreee</w:t>
-            </w:r>
-            <w:r>
-              <w:t xml:space="preserve"> par </w:t>
-            </w:r>
-            <w:r>
-              <w:rPr>
-                <w:rFonts w:ascii="Consolas" w:cs="Consolas" w:eastAsia="Consolas" w:hAnsi="Consolas"/>
-                <w:color w:val="00695C"/>
-                <w:sz w:val="19"/>
-                <w:szCs w:val="19"/>
-              </w:rPr>
-              <w:t xml:space="preserve">frmActionAssignee</w:t>
-            </w:r>
-            <w:r>
-              <w:t xml:space="preserve"> dans ce bouton.</w:t>
-            </w:r>
-          </w:p>
-        </w:tc>
-      </w:tr>
-    </w:tbl>
+    <w:p>
+      <w:pPr>
+        <w:spacing w:after="120"/>
+      </w:pPr>
+      <w:r>
+        <w:t xml:space="preserve">Exemple corrigé en octobre 2026 : le bouton Retour de </w:t>
+      </w:r>
+      <w:r>
+        <w:rPr>
+          <w:rFonts w:ascii="Consolas" w:cs="Consolas" w:eastAsia="Consolas" w:hAnsi="Consolas"/>
+          <w:color w:val="00695C"/>
+          <w:sz w:val="19"/>
+          <w:szCs w:val="19"/>
+        </w:rPr>
+        <w:t xml:space="preserve">ModifActionsAssig</w:t>
+      </w:r>
+      <w:r>
+        <w:t xml:space="preserve"> remettait à zéro le formulaire de l’écran Créées au lieu du sien (correction n°8).</w:t>
+      </w:r>
+    </w:p>
     <w:p>
       <w:pPr>
         <w:pStyle w:val="Heading2"/>
@@ -10052,6 +9953,130 @@
             </w:pPr>
             <w:r>
               <w:t xml:space="preserve">Calcul supprimé (ménage).</w:t>
+            </w:r>
+          </w:p>
+        </w:tc>
+      </w:tr>
+      <w:tr>
+        <w:tc>
+          <w:tcPr>
+            <w:tcW w:type="dxa" w:w="500"/>
+            <w:shd w:fill="F7F7F7" w:color="auto" w:val="clear"/>
+            <w:tcMar>
+              <w:top w:type="dxa" w:w="60"/>
+              <w:left w:type="dxa" w:w="100"/>
+              <w:bottom w:type="dxa" w:w="60"/>
+              <w:right w:type="dxa" w:w="100"/>
+            </w:tcMar>
+          </w:tcPr>
+          <w:p>
+            <w:pPr>
+              <w:spacing w:after="40" w:before="40"/>
+            </w:pPr>
+            <w:r>
+              <w:t xml:space="preserve">8</w:t>
+            </w:r>
+          </w:p>
+        </w:tc>
+        <w:tc>
+          <w:tcPr>
+            <w:tcW w:type="dxa" w:w="2300"/>
+            <w:shd w:fill="F7F7F7" w:color="auto" w:val="clear"/>
+            <w:tcMar>
+              <w:top w:type="dxa" w:w="60"/>
+              <w:left w:type="dxa" w:w="100"/>
+              <w:bottom w:type="dxa" w:w="60"/>
+              <w:right w:type="dxa" w:w="100"/>
+            </w:tcMar>
+          </w:tcPr>
+          <w:p>
+            <w:pPr>
+              <w:spacing w:after="40" w:before="40"/>
+            </w:pPr>
+            <w:r>
+              <w:rPr>
+                <w:rFonts w:ascii="Consolas" w:cs="Consolas" w:eastAsia="Consolas" w:hAnsi="Consolas"/>
+                <w:color w:val="00695C"/>
+                <w:sz w:val="19"/>
+                <w:szCs w:val="19"/>
+              </w:rPr>
+              <w:t xml:space="preserve">ModifActionsAssig</w:t>
+            </w:r>
+          </w:p>
+        </w:tc>
+        <w:tc>
+          <w:tcPr>
+            <w:tcW w:type="dxa" w:w="3700"/>
+            <w:shd w:fill="F7F7F7" w:color="auto" w:val="clear"/>
+            <w:tcMar>
+              <w:top w:type="dxa" w:w="60"/>
+              <w:left w:type="dxa" w:w="100"/>
+              <w:bottom w:type="dxa" w:w="60"/>
+              <w:right w:type="dxa" w:w="100"/>
+            </w:tcMar>
+          </w:tcPr>
+          <w:p>
+            <w:pPr>
+              <w:spacing w:after="40" w:before="40"/>
+            </w:pPr>
+            <w:r>
+              <w:t xml:space="preserve">Le bouton Retour (</w:t>
+            </w:r>
+            <w:r>
+              <w:rPr>
+                <w:rFonts w:ascii="Consolas" w:cs="Consolas" w:eastAsia="Consolas" w:hAnsi="Consolas"/>
+                <w:color w:val="00695C"/>
+                <w:sz w:val="19"/>
+                <w:szCs w:val="19"/>
+              </w:rPr>
+              <w:t xml:space="preserve">btnRetour_MAA</w:t>
+            </w:r>
+            <w:r>
+              <w:t xml:space="preserve">) annulait et remettait en lecture le formulaire de l’écran Créées (</w:t>
+            </w:r>
+            <w:r>
+              <w:rPr>
+                <w:rFonts w:ascii="Consolas" w:cs="Consolas" w:eastAsia="Consolas" w:hAnsi="Consolas"/>
+                <w:color w:val="00695C"/>
+                <w:sz w:val="19"/>
+                <w:szCs w:val="19"/>
+              </w:rPr>
+              <w:t xml:space="preserve">frmActionCreee</w:t>
+            </w:r>
+            <w:r>
+              <w:t xml:space="preserve">) : des saisies non enregistrées pouvaient rester affichées.</w:t>
+            </w:r>
+          </w:p>
+        </w:tc>
+        <w:tc>
+          <w:tcPr>
+            <w:tcW w:type="dxa" w:w="3138"/>
+            <w:shd w:fill="F7F7F7" w:color="auto" w:val="clear"/>
+            <w:tcMar>
+              <w:top w:type="dxa" w:w="60"/>
+              <w:left w:type="dxa" w:w="100"/>
+              <w:bottom w:type="dxa" w:w="60"/>
+              <w:right w:type="dxa" w:w="100"/>
+            </w:tcMar>
+          </w:tcPr>
+          <w:p>
+            <w:pPr>
+              <w:spacing w:after="40" w:before="40"/>
+            </w:pPr>
+            <w:r>
+              <w:t xml:space="preserve">Le bouton agit sur son propre formulaire (</w:t>
+            </w:r>
+            <w:r>
+              <w:rPr>
+                <w:rFonts w:ascii="Consolas" w:cs="Consolas" w:eastAsia="Consolas" w:hAnsi="Consolas"/>
+                <w:color w:val="00695C"/>
+                <w:sz w:val="19"/>
+                <w:szCs w:val="19"/>
+              </w:rPr>
+              <w:t xml:space="preserve">frmActionAssignee</w:t>
+            </w:r>
+            <w:r>
+              <w:t xml:space="preserve">).</w:t>
             </w:r>
           </w:p>
         </w:tc>

</xml_diff>